<commit_message>
Proyecto Corregido y mejorado de app de pesaje
</commit_message>
<xml_diff>
--- a/docs/Documentacion Pesaje.docx
+++ b/docs/Documentacion Pesaje.docx
@@ -423,6 +423,7 @@
     <w:p>
       <w:pPr>
         <w:pStyle w:val="Ttulo2"/>
+        <w:jc w:val="center"/>
         <w:rPr>
           <w:rFonts w:ascii="Arial" w:hAnsi="Arial" w:cs="Arial"/>
           <w:sz w:val="22"/>
@@ -530,6 +531,7 @@
     <w:p>
       <w:pPr>
         <w:pStyle w:val="Ttulo2"/>
+        <w:jc w:val="center"/>
         <w:rPr>
           <w:rFonts w:ascii="Arial" w:hAnsi="Arial" w:cs="Arial"/>
           <w:b/>
@@ -1783,6 +1785,7 @@
     <w:p>
       <w:pPr>
         <w:pStyle w:val="Ttulo2"/>
+        <w:jc w:val="center"/>
         <w:rPr>
           <w:rFonts w:ascii="Arial" w:hAnsi="Arial" w:cs="Arial"/>
           <w:b/>
@@ -2003,6 +2006,7 @@
     <w:p>
       <w:pPr>
         <w:pStyle w:val="Ttulo2"/>
+        <w:jc w:val="center"/>
         <w:rPr>
           <w:rFonts w:ascii="Arial" w:hAnsi="Arial" w:cs="Arial"/>
           <w:b/>
@@ -2162,6 +2166,7 @@
     <w:p>
       <w:pPr>
         <w:pStyle w:val="Ttulo3"/>
+        <w:jc w:val="center"/>
         <w:rPr>
           <w:rFonts w:ascii="Arial" w:hAnsi="Arial" w:cs="Arial"/>
           <w:b/>
@@ -2475,26 +2480,6 @@
     </w:p>
     <w:p>
       <w:pPr>
-        <w:pStyle w:val="NormalWeb"/>
-        <w:rPr>
-          <w:rFonts w:ascii="Arial" w:hAnsi="Arial" w:cs="Arial"/>
-          <w:sz w:val="22"/>
-          <w:szCs w:val="22"/>
-        </w:rPr>
-      </w:pPr>
-    </w:p>
-    <w:p>
-      <w:pPr>
-        <w:pStyle w:val="NormalWeb"/>
-        <w:rPr>
-          <w:rFonts w:ascii="Arial" w:hAnsi="Arial" w:cs="Arial"/>
-          <w:sz w:val="22"/>
-          <w:szCs w:val="22"/>
-        </w:rPr>
-      </w:pPr>
-    </w:p>
-    <w:p>
-      <w:pPr>
         <w:pStyle w:val="Ttulo2"/>
         <w:rPr>
           <w:rFonts w:ascii="Arial" w:hAnsi="Arial" w:cs="Arial"/>
@@ -2512,7 +2497,6 @@
           <w:sz w:val="22"/>
           <w:szCs w:val="22"/>
         </w:rPr>
-        <w:lastRenderedPageBreak/>
         <w:t>🐞</w:t>
       </w:r>
       <w:r>
@@ -2609,6 +2593,7 @@
           <w:sz w:val="22"/>
           <w:szCs w:val="22"/>
         </w:rPr>
+        <w:lastRenderedPageBreak/>
         <w:t>Funcionalidades principales:</w:t>
       </w:r>
     </w:p>
@@ -2981,6 +2966,7 @@
           <w:color w:val="002060"/>
           <w:sz w:val="22"/>
           <w:szCs w:val="22"/>
+          <w:u w:val="single"/>
         </w:rPr>
       </w:pPr>
       <w:r>
@@ -3079,366 +3065,871 @@
     </w:p>
     <w:p>
       <w:pPr>
-        <w:pStyle w:val="HTMLconformatoprevio"/>
-        <w:rPr>
-          <w:rStyle w:val="CdigoHTML"/>
-          <w:rFonts w:ascii="Arial" w:hAnsi="Arial" w:cs="Arial"/>
-          <w:sz w:val="22"/>
-          <w:szCs w:val="22"/>
-        </w:rPr>
-      </w:pPr>
+        <w:shd w:val="clear" w:color="auto" w:fill="151B23"/>
+        <w:tabs>
+          <w:tab w:val="left" w:pos="916"/>
+          <w:tab w:val="left" w:pos="1832"/>
+          <w:tab w:val="left" w:pos="2748"/>
+          <w:tab w:val="left" w:pos="3664"/>
+          <w:tab w:val="left" w:pos="4580"/>
+          <w:tab w:val="left" w:pos="5496"/>
+          <w:tab w:val="left" w:pos="6412"/>
+          <w:tab w:val="left" w:pos="7328"/>
+          <w:tab w:val="left" w:pos="8244"/>
+          <w:tab w:val="left" w:pos="9160"/>
+          <w:tab w:val="left" w:pos="10076"/>
+          <w:tab w:val="left" w:pos="10992"/>
+          <w:tab w:val="left" w:pos="11908"/>
+          <w:tab w:val="left" w:pos="12824"/>
+          <w:tab w:val="left" w:pos="13740"/>
+          <w:tab w:val="left" w:pos="14656"/>
+        </w:tabs>
+        <w:spacing w:after="0" w:line="240" w:lineRule="auto"/>
+        <w:rPr>
+          <w:rFonts w:ascii="Consolas" w:eastAsia="Times New Roman" w:hAnsi="Consolas" w:cs="Courier New"/>
+          <w:color w:val="F0F6FC"/>
+          <w:sz w:val="20"/>
+          <w:szCs w:val="20"/>
+          <w:bdr w:val="none" w:sz="0" w:space="0" w:color="auto" w:frame="1"/>
+          <w:lang w:eastAsia="es-CO"/>
+        </w:rPr>
+      </w:pPr>
+      <w:r>
+        <w:rPr>
+          <w:rFonts w:ascii="Consolas" w:eastAsia="Times New Roman" w:hAnsi="Consolas" w:cs="Courier New"/>
+          <w:color w:val="F0F6FC"/>
+          <w:sz w:val="20"/>
+          <w:szCs w:val="20"/>
+          <w:bdr w:val="none" w:sz="0" w:space="0" w:color="auto" w:frame="1"/>
+          <w:lang w:eastAsia="es-CO"/>
+        </w:rPr>
+        <w:t>PESAJE-APP/</w:t>
+      </w:r>
+    </w:p>
+    <w:p>
+      <w:pPr>
+        <w:shd w:val="clear" w:color="auto" w:fill="151B23"/>
+        <w:tabs>
+          <w:tab w:val="left" w:pos="916"/>
+          <w:tab w:val="left" w:pos="1832"/>
+          <w:tab w:val="left" w:pos="2748"/>
+          <w:tab w:val="left" w:pos="3664"/>
+          <w:tab w:val="left" w:pos="4580"/>
+          <w:tab w:val="left" w:pos="5496"/>
+          <w:tab w:val="left" w:pos="6412"/>
+          <w:tab w:val="left" w:pos="7328"/>
+          <w:tab w:val="left" w:pos="8244"/>
+          <w:tab w:val="left" w:pos="9160"/>
+          <w:tab w:val="left" w:pos="10076"/>
+          <w:tab w:val="left" w:pos="10992"/>
+          <w:tab w:val="left" w:pos="11908"/>
+          <w:tab w:val="left" w:pos="12824"/>
+          <w:tab w:val="left" w:pos="13740"/>
+          <w:tab w:val="left" w:pos="14656"/>
+        </w:tabs>
+        <w:spacing w:after="0" w:line="240" w:lineRule="auto"/>
+        <w:rPr>
+          <w:rFonts w:ascii="Consolas" w:eastAsia="Times New Roman" w:hAnsi="Consolas" w:cs="Courier New"/>
+          <w:color w:val="F0F6FC"/>
+          <w:sz w:val="20"/>
+          <w:szCs w:val="20"/>
+          <w:bdr w:val="none" w:sz="0" w:space="0" w:color="auto" w:frame="1"/>
+          <w:lang w:eastAsia="es-CO"/>
+        </w:rPr>
+      </w:pPr>
+      <w:r>
+        <w:rPr>
+          <w:rFonts w:ascii="Consolas" w:eastAsia="Times New Roman" w:hAnsi="Consolas" w:cs="Courier New"/>
+          <w:color w:val="F0F6FC"/>
+          <w:sz w:val="20"/>
+          <w:szCs w:val="20"/>
+          <w:bdr w:val="none" w:sz="0" w:space="0" w:color="auto" w:frame="1"/>
+          <w:lang w:eastAsia="es-CO"/>
+        </w:rPr>
+        <w:t xml:space="preserve">├── </w:t>
+      </w:r>
       <w:proofErr w:type="spellStart"/>
       <w:r>
         <w:rPr>
-          <w:rStyle w:val="CdigoHTML"/>
-          <w:rFonts w:ascii="Arial" w:hAnsi="Arial" w:cs="Arial"/>
-          <w:sz w:val="22"/>
-          <w:szCs w:val="22"/>
+          <w:rFonts w:ascii="Consolas" w:eastAsia="Times New Roman" w:hAnsi="Consolas" w:cs="Courier New"/>
+          <w:color w:val="F0F6FC"/>
+          <w:sz w:val="20"/>
+          <w:szCs w:val="20"/>
+          <w:bdr w:val="none" w:sz="0" w:space="0" w:color="auto" w:frame="1"/>
+          <w:lang w:eastAsia="es-CO"/>
         </w:rPr>
         <w:t>src</w:t>
       </w:r>
       <w:proofErr w:type="spellEnd"/>
       <w:r>
         <w:rPr>
-          <w:rStyle w:val="CdigoHTML"/>
-          <w:rFonts w:ascii="Arial" w:hAnsi="Arial" w:cs="Arial"/>
-          <w:sz w:val="22"/>
-          <w:szCs w:val="22"/>
+          <w:rFonts w:ascii="Consolas" w:eastAsia="Times New Roman" w:hAnsi="Consolas" w:cs="Courier New"/>
+          <w:color w:val="F0F6FC"/>
+          <w:sz w:val="20"/>
+          <w:szCs w:val="20"/>
+          <w:bdr w:val="none" w:sz="0" w:space="0" w:color="auto" w:frame="1"/>
+          <w:lang w:eastAsia="es-CO"/>
         </w:rPr>
         <w:t>/</w:t>
       </w:r>
     </w:p>
     <w:p>
       <w:pPr>
-        <w:pStyle w:val="HTMLconformatoprevio"/>
-        <w:rPr>
-          <w:rStyle w:val="CdigoHTML"/>
-          <w:rFonts w:ascii="Arial" w:hAnsi="Arial" w:cs="Arial"/>
-          <w:sz w:val="22"/>
-          <w:szCs w:val="22"/>
-        </w:rPr>
-      </w:pPr>
-      <w:r>
-        <w:rPr>
-          <w:rStyle w:val="CdigoHTML"/>
-          <w:rFonts w:ascii="Arial" w:hAnsi="Arial" w:cs="Arial"/>
-          <w:sz w:val="22"/>
-          <w:szCs w:val="22"/>
+        <w:shd w:val="clear" w:color="auto" w:fill="151B23"/>
+        <w:tabs>
+          <w:tab w:val="left" w:pos="916"/>
+          <w:tab w:val="left" w:pos="1832"/>
+          <w:tab w:val="left" w:pos="2748"/>
+          <w:tab w:val="left" w:pos="3664"/>
+          <w:tab w:val="left" w:pos="4580"/>
+          <w:tab w:val="left" w:pos="5496"/>
+          <w:tab w:val="left" w:pos="6412"/>
+          <w:tab w:val="left" w:pos="7328"/>
+          <w:tab w:val="left" w:pos="8244"/>
+          <w:tab w:val="left" w:pos="9160"/>
+          <w:tab w:val="left" w:pos="10076"/>
+          <w:tab w:val="left" w:pos="10992"/>
+          <w:tab w:val="left" w:pos="11908"/>
+          <w:tab w:val="left" w:pos="12824"/>
+          <w:tab w:val="left" w:pos="13740"/>
+          <w:tab w:val="left" w:pos="14656"/>
+        </w:tabs>
+        <w:spacing w:after="0" w:line="240" w:lineRule="auto"/>
+        <w:rPr>
+          <w:rFonts w:ascii="Consolas" w:eastAsia="Times New Roman" w:hAnsi="Consolas" w:cs="Courier New"/>
+          <w:color w:val="F0F6FC"/>
+          <w:sz w:val="20"/>
+          <w:szCs w:val="20"/>
+          <w:bdr w:val="none" w:sz="0" w:space="0" w:color="auto" w:frame="1"/>
+          <w:lang w:eastAsia="es-CO"/>
+        </w:rPr>
+      </w:pPr>
+      <w:r>
+        <w:rPr>
+          <w:rFonts w:ascii="Consolas" w:eastAsia="Times New Roman" w:hAnsi="Consolas" w:cs="Courier New"/>
+          <w:color w:val="F0F6FC"/>
+          <w:sz w:val="20"/>
+          <w:szCs w:val="20"/>
+          <w:bdr w:val="none" w:sz="0" w:space="0" w:color="auto" w:frame="1"/>
+          <w:lang w:eastAsia="es-CO"/>
+        </w:rPr>
+        <w:t xml:space="preserve">│   ├── </w:t>
+      </w:r>
+      <w:proofErr w:type="spellStart"/>
+      <w:r>
+        <w:rPr>
+          <w:rFonts w:ascii="Consolas" w:eastAsia="Times New Roman" w:hAnsi="Consolas" w:cs="Courier New"/>
+          <w:color w:val="F0F6FC"/>
+          <w:sz w:val="20"/>
+          <w:szCs w:val="20"/>
+          <w:bdr w:val="none" w:sz="0" w:space="0" w:color="auto" w:frame="1"/>
+          <w:lang w:eastAsia="es-CO"/>
+        </w:rPr>
+        <w:t>controller</w:t>
+      </w:r>
+      <w:proofErr w:type="spellEnd"/>
+      <w:r>
+        <w:rPr>
+          <w:rFonts w:ascii="Consolas" w:eastAsia="Times New Roman" w:hAnsi="Consolas" w:cs="Courier New"/>
+          <w:color w:val="F0F6FC"/>
+          <w:sz w:val="20"/>
+          <w:szCs w:val="20"/>
+          <w:bdr w:val="none" w:sz="0" w:space="0" w:color="auto" w:frame="1"/>
+          <w:lang w:eastAsia="es-CO"/>
+        </w:rPr>
+        <w:t>/</w:t>
+      </w:r>
+    </w:p>
+    <w:p>
+      <w:pPr>
+        <w:shd w:val="clear" w:color="auto" w:fill="151B23"/>
+        <w:tabs>
+          <w:tab w:val="left" w:pos="916"/>
+          <w:tab w:val="left" w:pos="1832"/>
+          <w:tab w:val="left" w:pos="2748"/>
+          <w:tab w:val="left" w:pos="3664"/>
+          <w:tab w:val="left" w:pos="4580"/>
+          <w:tab w:val="left" w:pos="5496"/>
+          <w:tab w:val="left" w:pos="6412"/>
+          <w:tab w:val="left" w:pos="7328"/>
+          <w:tab w:val="left" w:pos="8244"/>
+          <w:tab w:val="left" w:pos="9160"/>
+          <w:tab w:val="left" w:pos="10076"/>
+          <w:tab w:val="left" w:pos="10992"/>
+          <w:tab w:val="left" w:pos="11908"/>
+          <w:tab w:val="left" w:pos="12824"/>
+          <w:tab w:val="left" w:pos="13740"/>
+          <w:tab w:val="left" w:pos="14656"/>
+        </w:tabs>
+        <w:spacing w:after="0" w:line="240" w:lineRule="auto"/>
+        <w:rPr>
+          <w:rFonts w:ascii="Consolas" w:eastAsia="Times New Roman" w:hAnsi="Consolas" w:cs="Courier New"/>
+          <w:color w:val="F0F6FC"/>
+          <w:sz w:val="20"/>
+          <w:szCs w:val="20"/>
+          <w:bdr w:val="none" w:sz="0" w:space="0" w:color="auto" w:frame="1"/>
+          <w:lang w:eastAsia="es-CO"/>
+        </w:rPr>
+      </w:pPr>
+      <w:r>
+        <w:rPr>
+          <w:rFonts w:ascii="Consolas" w:eastAsia="Times New Roman" w:hAnsi="Consolas" w:cs="Courier New"/>
+          <w:color w:val="F0F6FC"/>
+          <w:sz w:val="20"/>
+          <w:szCs w:val="20"/>
+          <w:bdr w:val="none" w:sz="0" w:space="0" w:color="auto" w:frame="1"/>
+          <w:lang w:eastAsia="es-CO"/>
+        </w:rPr>
+        <w:t>│   │     └── PesajeController.java</w:t>
+      </w:r>
+    </w:p>
+    <w:p>
+      <w:pPr>
+        <w:shd w:val="clear" w:color="auto" w:fill="151B23"/>
+        <w:tabs>
+          <w:tab w:val="left" w:pos="916"/>
+          <w:tab w:val="left" w:pos="1832"/>
+          <w:tab w:val="left" w:pos="2748"/>
+          <w:tab w:val="left" w:pos="3664"/>
+          <w:tab w:val="left" w:pos="4580"/>
+          <w:tab w:val="left" w:pos="5496"/>
+          <w:tab w:val="left" w:pos="6412"/>
+          <w:tab w:val="left" w:pos="7328"/>
+          <w:tab w:val="left" w:pos="8244"/>
+          <w:tab w:val="left" w:pos="9160"/>
+          <w:tab w:val="left" w:pos="10076"/>
+          <w:tab w:val="left" w:pos="10992"/>
+          <w:tab w:val="left" w:pos="11908"/>
+          <w:tab w:val="left" w:pos="12824"/>
+          <w:tab w:val="left" w:pos="13740"/>
+          <w:tab w:val="left" w:pos="14656"/>
+        </w:tabs>
+        <w:spacing w:after="0" w:line="240" w:lineRule="auto"/>
+        <w:rPr>
+          <w:rFonts w:ascii="Consolas" w:eastAsia="Times New Roman" w:hAnsi="Consolas" w:cs="Courier New"/>
+          <w:color w:val="F0F6FC"/>
+          <w:sz w:val="20"/>
+          <w:szCs w:val="20"/>
+          <w:bdr w:val="none" w:sz="0" w:space="0" w:color="auto" w:frame="1"/>
+          <w:lang w:eastAsia="es-CO"/>
+        </w:rPr>
+      </w:pPr>
+      <w:r>
+        <w:rPr>
+          <w:rFonts w:ascii="Consolas" w:eastAsia="Times New Roman" w:hAnsi="Consolas" w:cs="Courier New"/>
+          <w:color w:val="F0F6FC"/>
+          <w:sz w:val="20"/>
+          <w:szCs w:val="20"/>
+          <w:bdr w:val="none" w:sz="0" w:space="0" w:color="auto" w:frame="1"/>
+          <w:lang w:eastAsia="es-CO"/>
+        </w:rPr>
+        <w:t xml:space="preserve">│   ├── </w:t>
+      </w:r>
+      <w:proofErr w:type="spellStart"/>
+      <w:r>
+        <w:rPr>
+          <w:rFonts w:ascii="Consolas" w:eastAsia="Times New Roman" w:hAnsi="Consolas" w:cs="Courier New"/>
+          <w:color w:val="F0F6FC"/>
+          <w:sz w:val="20"/>
+          <w:szCs w:val="20"/>
+          <w:bdr w:val="none" w:sz="0" w:space="0" w:color="auto" w:frame="1"/>
+          <w:lang w:eastAsia="es-CO"/>
+        </w:rPr>
+        <w:t>model</w:t>
+      </w:r>
+      <w:proofErr w:type="spellEnd"/>
+      <w:r>
+        <w:rPr>
+          <w:rFonts w:ascii="Consolas" w:eastAsia="Times New Roman" w:hAnsi="Consolas" w:cs="Courier New"/>
+          <w:color w:val="F0F6FC"/>
+          <w:sz w:val="20"/>
+          <w:szCs w:val="20"/>
+          <w:bdr w:val="none" w:sz="0" w:space="0" w:color="auto" w:frame="1"/>
+          <w:lang w:eastAsia="es-CO"/>
+        </w:rPr>
+        <w:t>/</w:t>
+      </w:r>
+    </w:p>
+    <w:p>
+      <w:pPr>
+        <w:shd w:val="clear" w:color="auto" w:fill="151B23"/>
+        <w:tabs>
+          <w:tab w:val="left" w:pos="916"/>
+          <w:tab w:val="left" w:pos="1832"/>
+          <w:tab w:val="left" w:pos="2748"/>
+          <w:tab w:val="left" w:pos="3664"/>
+          <w:tab w:val="left" w:pos="4580"/>
+          <w:tab w:val="left" w:pos="5496"/>
+          <w:tab w:val="left" w:pos="6412"/>
+          <w:tab w:val="left" w:pos="7328"/>
+          <w:tab w:val="left" w:pos="8244"/>
+          <w:tab w:val="left" w:pos="9160"/>
+          <w:tab w:val="left" w:pos="10076"/>
+          <w:tab w:val="left" w:pos="10992"/>
+          <w:tab w:val="left" w:pos="11908"/>
+          <w:tab w:val="left" w:pos="12824"/>
+          <w:tab w:val="left" w:pos="13740"/>
+          <w:tab w:val="left" w:pos="14656"/>
+        </w:tabs>
+        <w:spacing w:after="0" w:line="240" w:lineRule="auto"/>
+        <w:rPr>
+          <w:rFonts w:ascii="Consolas" w:eastAsia="Times New Roman" w:hAnsi="Consolas" w:cs="Courier New"/>
+          <w:color w:val="F0F6FC"/>
+          <w:sz w:val="20"/>
+          <w:szCs w:val="20"/>
+          <w:bdr w:val="none" w:sz="0" w:space="0" w:color="auto" w:frame="1"/>
+          <w:lang w:eastAsia="es-CO"/>
+        </w:rPr>
+      </w:pPr>
+      <w:r>
+        <w:rPr>
+          <w:rFonts w:ascii="Consolas" w:eastAsia="Times New Roman" w:hAnsi="Consolas" w:cs="Courier New"/>
+          <w:color w:val="F0F6FC"/>
+          <w:sz w:val="20"/>
+          <w:szCs w:val="20"/>
+          <w:bdr w:val="none" w:sz="0" w:space="0" w:color="auto" w:frame="1"/>
+          <w:lang w:eastAsia="es-CO"/>
+        </w:rPr>
+        <w:t>│   │     ├── Pesaje.java</w:t>
+      </w:r>
+    </w:p>
+    <w:p>
+      <w:pPr>
+        <w:shd w:val="clear" w:color="auto" w:fill="151B23"/>
+        <w:tabs>
+          <w:tab w:val="left" w:pos="916"/>
+          <w:tab w:val="left" w:pos="1832"/>
+          <w:tab w:val="left" w:pos="2748"/>
+          <w:tab w:val="left" w:pos="3664"/>
+          <w:tab w:val="left" w:pos="4580"/>
+          <w:tab w:val="left" w:pos="5496"/>
+          <w:tab w:val="left" w:pos="6412"/>
+          <w:tab w:val="left" w:pos="7328"/>
+          <w:tab w:val="left" w:pos="8244"/>
+          <w:tab w:val="left" w:pos="9160"/>
+          <w:tab w:val="left" w:pos="10076"/>
+          <w:tab w:val="left" w:pos="10992"/>
+          <w:tab w:val="left" w:pos="11908"/>
+          <w:tab w:val="left" w:pos="12824"/>
+          <w:tab w:val="left" w:pos="13740"/>
+          <w:tab w:val="left" w:pos="14656"/>
+        </w:tabs>
+        <w:spacing w:after="0" w:line="240" w:lineRule="auto"/>
+        <w:rPr>
+          <w:rFonts w:ascii="Consolas" w:eastAsia="Times New Roman" w:hAnsi="Consolas" w:cs="Courier New"/>
+          <w:color w:val="F0F6FC"/>
+          <w:sz w:val="20"/>
+          <w:szCs w:val="20"/>
+          <w:bdr w:val="none" w:sz="0" w:space="0" w:color="auto" w:frame="1"/>
+          <w:lang w:eastAsia="es-CO"/>
+        </w:rPr>
+      </w:pPr>
+      <w:r>
+        <w:rPr>
+          <w:rFonts w:ascii="Consolas" w:eastAsia="Times New Roman" w:hAnsi="Consolas" w:cs="Courier New"/>
+          <w:color w:val="F0F6FC"/>
+          <w:sz w:val="20"/>
+          <w:szCs w:val="20"/>
+          <w:bdr w:val="none" w:sz="0" w:space="0" w:color="auto" w:frame="1"/>
+          <w:lang w:eastAsia="es-CO"/>
+        </w:rPr>
+        <w:t xml:space="preserve">│   │     ├── PesajeManager.java </w:t>
+      </w:r>
+    </w:p>
+    <w:p>
+      <w:pPr>
+        <w:shd w:val="clear" w:color="auto" w:fill="151B23"/>
+        <w:tabs>
+          <w:tab w:val="left" w:pos="916"/>
+          <w:tab w:val="left" w:pos="1832"/>
+          <w:tab w:val="left" w:pos="2748"/>
+          <w:tab w:val="left" w:pos="3664"/>
+          <w:tab w:val="left" w:pos="4580"/>
+          <w:tab w:val="left" w:pos="5496"/>
+          <w:tab w:val="left" w:pos="6412"/>
+          <w:tab w:val="left" w:pos="7328"/>
+          <w:tab w:val="left" w:pos="8244"/>
+          <w:tab w:val="left" w:pos="9160"/>
+          <w:tab w:val="left" w:pos="10076"/>
+          <w:tab w:val="left" w:pos="10992"/>
+          <w:tab w:val="left" w:pos="11908"/>
+          <w:tab w:val="left" w:pos="12824"/>
+          <w:tab w:val="left" w:pos="13740"/>
+          <w:tab w:val="left" w:pos="14656"/>
+        </w:tabs>
+        <w:spacing w:after="0" w:line="240" w:lineRule="auto"/>
+        <w:rPr>
+          <w:rFonts w:ascii="Consolas" w:eastAsia="Times New Roman" w:hAnsi="Consolas" w:cs="Courier New"/>
+          <w:color w:val="F0F6FC"/>
+          <w:sz w:val="20"/>
+          <w:szCs w:val="20"/>
+          <w:bdr w:val="none" w:sz="0" w:space="0" w:color="auto" w:frame="1"/>
+          <w:lang w:eastAsia="es-CO"/>
+        </w:rPr>
+      </w:pPr>
+      <w:r>
+        <w:rPr>
+          <w:rFonts w:ascii="Consolas" w:eastAsia="Times New Roman" w:hAnsi="Consolas" w:cs="Courier New"/>
+          <w:color w:val="F0F6FC"/>
+          <w:sz w:val="20"/>
+          <w:szCs w:val="20"/>
+          <w:bdr w:val="none" w:sz="0" w:space="0" w:color="auto" w:frame="1"/>
+          <w:lang w:eastAsia="es-CO"/>
+        </w:rPr>
+        <w:t>│   │     └── PesajeObserver.java</w:t>
+      </w:r>
+    </w:p>
+    <w:p>
+      <w:pPr>
+        <w:shd w:val="clear" w:color="auto" w:fill="151B23"/>
+        <w:tabs>
+          <w:tab w:val="left" w:pos="916"/>
+          <w:tab w:val="left" w:pos="1832"/>
+          <w:tab w:val="left" w:pos="2748"/>
+          <w:tab w:val="left" w:pos="3664"/>
+          <w:tab w:val="left" w:pos="4580"/>
+          <w:tab w:val="left" w:pos="5496"/>
+          <w:tab w:val="left" w:pos="6412"/>
+          <w:tab w:val="left" w:pos="7328"/>
+          <w:tab w:val="left" w:pos="8244"/>
+          <w:tab w:val="left" w:pos="9160"/>
+          <w:tab w:val="left" w:pos="10076"/>
+          <w:tab w:val="left" w:pos="10992"/>
+          <w:tab w:val="left" w:pos="11908"/>
+          <w:tab w:val="left" w:pos="12824"/>
+          <w:tab w:val="left" w:pos="13740"/>
+          <w:tab w:val="left" w:pos="14656"/>
+        </w:tabs>
+        <w:spacing w:after="0" w:line="240" w:lineRule="auto"/>
+        <w:rPr>
+          <w:rFonts w:ascii="Consolas" w:eastAsia="Times New Roman" w:hAnsi="Consolas" w:cs="Courier New"/>
+          <w:color w:val="F0F6FC"/>
+          <w:sz w:val="20"/>
+          <w:szCs w:val="20"/>
+          <w:bdr w:val="none" w:sz="0" w:space="0" w:color="auto" w:frame="1"/>
+          <w:lang w:eastAsia="es-CO"/>
+        </w:rPr>
+      </w:pPr>
+      <w:r>
+        <w:rPr>
+          <w:rFonts w:ascii="Consolas" w:eastAsia="Times New Roman" w:hAnsi="Consolas" w:cs="Courier New"/>
+          <w:color w:val="F0F6FC"/>
+          <w:sz w:val="20"/>
+          <w:szCs w:val="20"/>
+          <w:bdr w:val="none" w:sz="0" w:space="0" w:color="auto" w:frame="1"/>
+          <w:lang w:eastAsia="es-CO"/>
+        </w:rPr>
+        <w:t xml:space="preserve">│   ├── </w:t>
+      </w:r>
+      <w:proofErr w:type="spellStart"/>
+      <w:r>
+        <w:rPr>
+          <w:rFonts w:ascii="Consolas" w:eastAsia="Times New Roman" w:hAnsi="Consolas" w:cs="Courier New"/>
+          <w:color w:val="F0F6FC"/>
+          <w:sz w:val="20"/>
+          <w:szCs w:val="20"/>
+          <w:bdr w:val="none" w:sz="0" w:space="0" w:color="auto" w:frame="1"/>
+          <w:lang w:eastAsia="es-CO"/>
+        </w:rPr>
+        <w:t>view</w:t>
+      </w:r>
+      <w:proofErr w:type="spellEnd"/>
+      <w:r>
+        <w:rPr>
+          <w:rFonts w:ascii="Consolas" w:eastAsia="Times New Roman" w:hAnsi="Consolas" w:cs="Courier New"/>
+          <w:color w:val="F0F6FC"/>
+          <w:sz w:val="20"/>
+          <w:szCs w:val="20"/>
+          <w:bdr w:val="none" w:sz="0" w:space="0" w:color="auto" w:frame="1"/>
+          <w:lang w:eastAsia="es-CO"/>
+        </w:rPr>
+        <w:t>/</w:t>
+      </w:r>
+    </w:p>
+    <w:p>
+      <w:pPr>
+        <w:shd w:val="clear" w:color="auto" w:fill="151B23"/>
+        <w:tabs>
+          <w:tab w:val="left" w:pos="916"/>
+          <w:tab w:val="left" w:pos="1832"/>
+          <w:tab w:val="left" w:pos="2748"/>
+          <w:tab w:val="left" w:pos="3664"/>
+          <w:tab w:val="left" w:pos="4580"/>
+          <w:tab w:val="left" w:pos="5496"/>
+          <w:tab w:val="left" w:pos="6412"/>
+          <w:tab w:val="left" w:pos="7328"/>
+          <w:tab w:val="left" w:pos="8244"/>
+          <w:tab w:val="left" w:pos="9160"/>
+          <w:tab w:val="left" w:pos="10076"/>
+          <w:tab w:val="left" w:pos="10992"/>
+          <w:tab w:val="left" w:pos="11908"/>
+          <w:tab w:val="left" w:pos="12824"/>
+          <w:tab w:val="left" w:pos="13740"/>
+          <w:tab w:val="left" w:pos="14656"/>
+        </w:tabs>
+        <w:spacing w:after="0" w:line="240" w:lineRule="auto"/>
+        <w:rPr>
+          <w:rFonts w:ascii="Consolas" w:eastAsia="Times New Roman" w:hAnsi="Consolas" w:cs="Courier New"/>
+          <w:color w:val="F0F6FC"/>
+          <w:sz w:val="20"/>
+          <w:szCs w:val="20"/>
+          <w:bdr w:val="none" w:sz="0" w:space="0" w:color="auto" w:frame="1"/>
+          <w:lang w:eastAsia="es-CO"/>
+        </w:rPr>
+      </w:pPr>
+      <w:r>
+        <w:rPr>
+          <w:rFonts w:ascii="Consolas" w:eastAsia="Times New Roman" w:hAnsi="Consolas" w:cs="Courier New"/>
+          <w:color w:val="F0F6FC"/>
+          <w:sz w:val="20"/>
+          <w:szCs w:val="20"/>
+          <w:bdr w:val="none" w:sz="0" w:space="0" w:color="auto" w:frame="1"/>
+          <w:lang w:eastAsia="es-CO"/>
+        </w:rPr>
+        <w:t>│   │     └── MainView.java</w:t>
+      </w:r>
+    </w:p>
+    <w:p>
+      <w:pPr>
+        <w:shd w:val="clear" w:color="auto" w:fill="151B23"/>
+        <w:tabs>
+          <w:tab w:val="left" w:pos="916"/>
+          <w:tab w:val="left" w:pos="1832"/>
+          <w:tab w:val="left" w:pos="2748"/>
+          <w:tab w:val="left" w:pos="3664"/>
+          <w:tab w:val="left" w:pos="4580"/>
+          <w:tab w:val="left" w:pos="5496"/>
+          <w:tab w:val="left" w:pos="6412"/>
+          <w:tab w:val="left" w:pos="7328"/>
+          <w:tab w:val="left" w:pos="8244"/>
+          <w:tab w:val="left" w:pos="9160"/>
+          <w:tab w:val="left" w:pos="10076"/>
+          <w:tab w:val="left" w:pos="10992"/>
+          <w:tab w:val="left" w:pos="11908"/>
+          <w:tab w:val="left" w:pos="12824"/>
+          <w:tab w:val="left" w:pos="13740"/>
+          <w:tab w:val="left" w:pos="14656"/>
+        </w:tabs>
+        <w:spacing w:after="0" w:line="240" w:lineRule="auto"/>
+        <w:rPr>
+          <w:rFonts w:ascii="Consolas" w:eastAsia="Times New Roman" w:hAnsi="Consolas" w:cs="Courier New"/>
+          <w:color w:val="F0F6FC"/>
+          <w:sz w:val="20"/>
+          <w:szCs w:val="20"/>
+          <w:bdr w:val="none" w:sz="0" w:space="0" w:color="auto" w:frame="1"/>
+          <w:lang w:eastAsia="es-CO"/>
+        </w:rPr>
+      </w:pPr>
+      <w:r>
+        <w:rPr>
+          <w:rFonts w:ascii="Consolas" w:eastAsia="Times New Roman" w:hAnsi="Consolas" w:cs="Courier New"/>
+          <w:color w:val="F0F6FC"/>
+          <w:sz w:val="20"/>
+          <w:szCs w:val="20"/>
+          <w:bdr w:val="none" w:sz="0" w:space="0" w:color="auto" w:frame="1"/>
+          <w:lang w:eastAsia="es-CO"/>
+        </w:rPr>
+        <w:t>│   └── Main.java</w:t>
+      </w:r>
+    </w:p>
+    <w:p>
+      <w:pPr>
+        <w:shd w:val="clear" w:color="auto" w:fill="151B23"/>
+        <w:tabs>
+          <w:tab w:val="left" w:pos="916"/>
+          <w:tab w:val="left" w:pos="1832"/>
+          <w:tab w:val="left" w:pos="2748"/>
+          <w:tab w:val="left" w:pos="3664"/>
+          <w:tab w:val="left" w:pos="4580"/>
+          <w:tab w:val="left" w:pos="5496"/>
+          <w:tab w:val="left" w:pos="6412"/>
+          <w:tab w:val="left" w:pos="7328"/>
+          <w:tab w:val="left" w:pos="8244"/>
+          <w:tab w:val="left" w:pos="9160"/>
+          <w:tab w:val="left" w:pos="10076"/>
+          <w:tab w:val="left" w:pos="10992"/>
+          <w:tab w:val="left" w:pos="11908"/>
+          <w:tab w:val="left" w:pos="12824"/>
+          <w:tab w:val="left" w:pos="13740"/>
+          <w:tab w:val="left" w:pos="14656"/>
+        </w:tabs>
+        <w:spacing w:after="0" w:line="240" w:lineRule="auto"/>
+        <w:rPr>
+          <w:rFonts w:ascii="Consolas" w:eastAsia="Times New Roman" w:hAnsi="Consolas" w:cs="Courier New"/>
+          <w:color w:val="F0F6FC"/>
+          <w:sz w:val="20"/>
+          <w:szCs w:val="20"/>
+          <w:bdr w:val="none" w:sz="0" w:space="0" w:color="auto" w:frame="1"/>
+          <w:lang w:eastAsia="es-CO"/>
+        </w:rPr>
+      </w:pPr>
+      <w:r>
+        <w:rPr>
+          <w:rFonts w:ascii="Consolas" w:eastAsia="Times New Roman" w:hAnsi="Consolas" w:cs="Courier New"/>
+          <w:color w:val="F0F6FC"/>
+          <w:sz w:val="20"/>
+          <w:szCs w:val="20"/>
+          <w:bdr w:val="none" w:sz="0" w:space="0" w:color="auto" w:frame="1"/>
+          <w:lang w:eastAsia="es-CO"/>
         </w:rPr>
         <w:t>│</w:t>
       </w:r>
     </w:p>
     <w:p>
       <w:pPr>
-        <w:pStyle w:val="HTMLconformatoprevio"/>
-        <w:rPr>
-          <w:rStyle w:val="CdigoHTML"/>
-          <w:rFonts w:ascii="Arial" w:hAnsi="Arial" w:cs="Arial"/>
-          <w:sz w:val="22"/>
-          <w:szCs w:val="22"/>
-        </w:rPr>
-      </w:pPr>
-      <w:r>
-        <w:rPr>
-          <w:rStyle w:val="CdigoHTML"/>
-          <w:rFonts w:ascii="Arial" w:hAnsi="Arial" w:cs="Arial"/>
-          <w:sz w:val="22"/>
-          <w:szCs w:val="22"/>
+        <w:shd w:val="clear" w:color="auto" w:fill="151B23"/>
+        <w:tabs>
+          <w:tab w:val="left" w:pos="916"/>
+          <w:tab w:val="left" w:pos="1832"/>
+          <w:tab w:val="left" w:pos="2748"/>
+          <w:tab w:val="left" w:pos="3664"/>
+          <w:tab w:val="left" w:pos="4580"/>
+          <w:tab w:val="left" w:pos="5496"/>
+          <w:tab w:val="left" w:pos="6412"/>
+          <w:tab w:val="left" w:pos="7328"/>
+          <w:tab w:val="left" w:pos="8244"/>
+          <w:tab w:val="left" w:pos="9160"/>
+          <w:tab w:val="left" w:pos="10076"/>
+          <w:tab w:val="left" w:pos="10992"/>
+          <w:tab w:val="left" w:pos="11908"/>
+          <w:tab w:val="left" w:pos="12824"/>
+          <w:tab w:val="left" w:pos="13740"/>
+          <w:tab w:val="left" w:pos="14656"/>
+        </w:tabs>
+        <w:spacing w:after="0" w:line="240" w:lineRule="auto"/>
+        <w:rPr>
+          <w:rFonts w:ascii="Consolas" w:eastAsia="Times New Roman" w:hAnsi="Consolas" w:cs="Courier New"/>
+          <w:color w:val="F0F6FC"/>
+          <w:sz w:val="20"/>
+          <w:szCs w:val="20"/>
+          <w:bdr w:val="none" w:sz="0" w:space="0" w:color="auto" w:frame="1"/>
+          <w:lang w:eastAsia="es-CO"/>
+        </w:rPr>
+      </w:pPr>
+      <w:r>
+        <w:rPr>
+          <w:rFonts w:ascii="Consolas" w:eastAsia="Times New Roman" w:hAnsi="Consolas" w:cs="Courier New"/>
+          <w:color w:val="F0F6FC"/>
+          <w:sz w:val="20"/>
+          <w:szCs w:val="20"/>
+          <w:bdr w:val="none" w:sz="0" w:space="0" w:color="auto" w:frame="1"/>
+          <w:lang w:eastAsia="es-CO"/>
         </w:rPr>
         <w:t xml:space="preserve">├── </w:t>
       </w:r>
       <w:proofErr w:type="spellStart"/>
       <w:r>
         <w:rPr>
-          <w:rStyle w:val="CdigoHTML"/>
-          <w:rFonts w:ascii="Arial" w:hAnsi="Arial" w:cs="Arial"/>
-          <w:sz w:val="22"/>
-          <w:szCs w:val="22"/>
-        </w:rPr>
-        <w:t>model</w:t>
+          <w:rFonts w:ascii="Consolas" w:eastAsia="Times New Roman" w:hAnsi="Consolas" w:cs="Courier New"/>
+          <w:color w:val="F0F6FC"/>
+          <w:sz w:val="20"/>
+          <w:szCs w:val="20"/>
+          <w:bdr w:val="none" w:sz="0" w:space="0" w:color="auto" w:frame="1"/>
+          <w:lang w:eastAsia="es-CO"/>
+        </w:rPr>
+        <w:t>docs</w:t>
       </w:r>
       <w:proofErr w:type="spellEnd"/>
       <w:r>
         <w:rPr>
-          <w:rStyle w:val="CdigoHTML"/>
-          <w:rFonts w:ascii="Arial" w:hAnsi="Arial" w:cs="Arial"/>
-          <w:sz w:val="22"/>
-          <w:szCs w:val="22"/>
+          <w:rFonts w:ascii="Consolas" w:eastAsia="Times New Roman" w:hAnsi="Consolas" w:cs="Courier New"/>
+          <w:color w:val="F0F6FC"/>
+          <w:sz w:val="20"/>
+          <w:szCs w:val="20"/>
+          <w:bdr w:val="none" w:sz="0" w:space="0" w:color="auto" w:frame="1"/>
+          <w:lang w:eastAsia="es-CO"/>
         </w:rPr>
         <w:t>/</w:t>
       </w:r>
     </w:p>
     <w:p>
       <w:pPr>
-        <w:pStyle w:val="HTMLconformatoprevio"/>
-        <w:rPr>
-          <w:rStyle w:val="CdigoHTML"/>
-          <w:rFonts w:ascii="Arial" w:hAnsi="Arial" w:cs="Arial"/>
-          <w:sz w:val="22"/>
-          <w:szCs w:val="22"/>
-        </w:rPr>
-      </w:pPr>
-      <w:r>
-        <w:rPr>
-          <w:rStyle w:val="CdigoHTML"/>
-          <w:rFonts w:ascii="Arial" w:hAnsi="Arial" w:cs="Arial"/>
-          <w:sz w:val="22"/>
-          <w:szCs w:val="22"/>
-        </w:rPr>
-        <w:t>│   ├── Pesaje.java</w:t>
-      </w:r>
-    </w:p>
-    <w:p>
-      <w:pPr>
-        <w:pStyle w:val="HTMLconformatoprevio"/>
-        <w:rPr>
-          <w:rStyle w:val="CdigoHTML"/>
-          <w:rFonts w:ascii="Arial" w:hAnsi="Arial" w:cs="Arial"/>
-          <w:sz w:val="22"/>
-          <w:szCs w:val="22"/>
-        </w:rPr>
-      </w:pPr>
-      <w:r>
-        <w:rPr>
-          <w:rStyle w:val="CdigoHTML"/>
-          <w:rFonts w:ascii="Arial" w:hAnsi="Arial" w:cs="Arial"/>
-          <w:sz w:val="22"/>
-          <w:szCs w:val="22"/>
-        </w:rPr>
-        <w:t>│   ├── PesajeManager.java</w:t>
-      </w:r>
-    </w:p>
-    <w:p>
-      <w:pPr>
-        <w:pStyle w:val="HTMLconformatoprevio"/>
-        <w:rPr>
-          <w:rStyle w:val="CdigoHTML"/>
-          <w:rFonts w:ascii="Arial" w:hAnsi="Arial" w:cs="Arial"/>
-          <w:sz w:val="22"/>
-          <w:szCs w:val="22"/>
-        </w:rPr>
-      </w:pPr>
-      <w:r>
-        <w:rPr>
-          <w:rStyle w:val="CdigoHTML"/>
-          <w:rFonts w:ascii="Arial" w:hAnsi="Arial" w:cs="Arial"/>
-          <w:sz w:val="22"/>
-          <w:szCs w:val="22"/>
-        </w:rPr>
-        <w:t>│   └── PesajeObserver.java</w:t>
-      </w:r>
-    </w:p>
-    <w:p>
-      <w:pPr>
-        <w:pStyle w:val="HTMLconformatoprevio"/>
-        <w:rPr>
-          <w:rStyle w:val="CdigoHTML"/>
-          <w:rFonts w:ascii="Arial" w:hAnsi="Arial" w:cs="Arial"/>
-          <w:sz w:val="22"/>
-          <w:szCs w:val="22"/>
-        </w:rPr>
-      </w:pPr>
-      <w:r>
-        <w:rPr>
-          <w:rStyle w:val="CdigoHTML"/>
-          <w:rFonts w:ascii="Arial" w:hAnsi="Arial" w:cs="Arial"/>
-          <w:sz w:val="22"/>
-          <w:szCs w:val="22"/>
-        </w:rPr>
-        <w:t>│</w:t>
-      </w:r>
-    </w:p>
-    <w:p>
-      <w:pPr>
-        <w:pStyle w:val="HTMLconformatoprevio"/>
-        <w:rPr>
-          <w:rStyle w:val="CdigoHTML"/>
-          <w:rFonts w:ascii="Arial" w:hAnsi="Arial" w:cs="Arial"/>
-          <w:sz w:val="22"/>
-          <w:szCs w:val="22"/>
-        </w:rPr>
-      </w:pPr>
-      <w:r>
-        <w:rPr>
-          <w:rStyle w:val="CdigoHTML"/>
-          <w:rFonts w:ascii="Arial" w:hAnsi="Arial" w:cs="Arial"/>
-          <w:sz w:val="22"/>
-          <w:szCs w:val="22"/>
+        <w:shd w:val="clear" w:color="auto" w:fill="151B23"/>
+        <w:tabs>
+          <w:tab w:val="left" w:pos="916"/>
+          <w:tab w:val="left" w:pos="1832"/>
+          <w:tab w:val="left" w:pos="2748"/>
+          <w:tab w:val="left" w:pos="3664"/>
+          <w:tab w:val="left" w:pos="4580"/>
+          <w:tab w:val="left" w:pos="5496"/>
+          <w:tab w:val="left" w:pos="6412"/>
+          <w:tab w:val="left" w:pos="7328"/>
+          <w:tab w:val="left" w:pos="8244"/>
+          <w:tab w:val="left" w:pos="9160"/>
+          <w:tab w:val="left" w:pos="10076"/>
+          <w:tab w:val="left" w:pos="10992"/>
+          <w:tab w:val="left" w:pos="11908"/>
+          <w:tab w:val="left" w:pos="12824"/>
+          <w:tab w:val="left" w:pos="13740"/>
+          <w:tab w:val="left" w:pos="14656"/>
+        </w:tabs>
+        <w:spacing w:after="0" w:line="240" w:lineRule="auto"/>
+        <w:rPr>
+          <w:rFonts w:ascii="Consolas" w:eastAsia="Times New Roman" w:hAnsi="Consolas" w:cs="Courier New"/>
+          <w:color w:val="F0F6FC"/>
+          <w:sz w:val="20"/>
+          <w:szCs w:val="20"/>
+          <w:bdr w:val="none" w:sz="0" w:space="0" w:color="auto" w:frame="1"/>
+          <w:lang w:eastAsia="es-CO"/>
+        </w:rPr>
+      </w:pPr>
+      <w:r>
+        <w:rPr>
+          <w:rFonts w:ascii="Consolas" w:eastAsia="Times New Roman" w:hAnsi="Consolas" w:cs="Courier New"/>
+          <w:color w:val="F0F6FC"/>
+          <w:sz w:val="20"/>
+          <w:szCs w:val="20"/>
+          <w:bdr w:val="none" w:sz="0" w:space="0" w:color="auto" w:frame="1"/>
+          <w:lang w:eastAsia="es-CO"/>
         </w:rPr>
         <w:t xml:space="preserve">├── </w:t>
       </w:r>
       <w:proofErr w:type="spellStart"/>
       <w:r>
         <w:rPr>
-          <w:rStyle w:val="CdigoHTML"/>
-          <w:rFonts w:ascii="Arial" w:hAnsi="Arial" w:cs="Arial"/>
-          <w:sz w:val="22"/>
-          <w:szCs w:val="22"/>
-        </w:rPr>
-        <w:t>controller</w:t>
+          <w:rFonts w:ascii="Consolas" w:eastAsia="Times New Roman" w:hAnsi="Consolas" w:cs="Courier New"/>
+          <w:color w:val="F0F6FC"/>
+          <w:sz w:val="20"/>
+          <w:szCs w:val="20"/>
+          <w:bdr w:val="none" w:sz="0" w:space="0" w:color="auto" w:frame="1"/>
+          <w:lang w:eastAsia="es-CO"/>
+        </w:rPr>
+        <w:t>Documentacion</w:t>
       </w:r>
       <w:proofErr w:type="spellEnd"/>
       <w:r>
         <w:rPr>
-          <w:rStyle w:val="CdigoHTML"/>
-          <w:rFonts w:ascii="Arial" w:hAnsi="Arial" w:cs="Arial"/>
-          <w:sz w:val="22"/>
-          <w:szCs w:val="22"/>
-        </w:rPr>
-        <w:t>/</w:t>
-      </w:r>
-    </w:p>
-    <w:p>
-      <w:pPr>
-        <w:pStyle w:val="HTMLconformatoprevio"/>
-        <w:rPr>
-          <w:rStyle w:val="CdigoHTML"/>
-          <w:rFonts w:ascii="Arial" w:hAnsi="Arial" w:cs="Arial"/>
-          <w:sz w:val="22"/>
-          <w:szCs w:val="22"/>
-        </w:rPr>
-      </w:pPr>
-      <w:r>
-        <w:rPr>
-          <w:rStyle w:val="CdigoHTML"/>
-          <w:rFonts w:ascii="Arial" w:hAnsi="Arial" w:cs="Arial"/>
-          <w:sz w:val="22"/>
-          <w:szCs w:val="22"/>
-        </w:rPr>
-        <w:t>│   └── PesajeController.java</w:t>
-      </w:r>
-    </w:p>
-    <w:p>
-      <w:pPr>
-        <w:pStyle w:val="HTMLconformatoprevio"/>
-        <w:rPr>
-          <w:rStyle w:val="CdigoHTML"/>
-          <w:rFonts w:ascii="Arial" w:hAnsi="Arial" w:cs="Arial"/>
-          <w:sz w:val="22"/>
-          <w:szCs w:val="22"/>
-        </w:rPr>
-      </w:pPr>
-      <w:r>
-        <w:rPr>
-          <w:rStyle w:val="CdigoHTML"/>
-          <w:rFonts w:ascii="Arial" w:hAnsi="Arial" w:cs="Arial"/>
-          <w:sz w:val="22"/>
-          <w:szCs w:val="22"/>
-        </w:rPr>
-        <w:t>│</w:t>
-      </w:r>
-    </w:p>
-    <w:p>
-      <w:pPr>
-        <w:pStyle w:val="HTMLconformatoprevio"/>
-        <w:rPr>
-          <w:rStyle w:val="CdigoHTML"/>
-          <w:rFonts w:ascii="Arial" w:hAnsi="Arial" w:cs="Arial"/>
-          <w:sz w:val="22"/>
-          <w:szCs w:val="22"/>
-        </w:rPr>
-      </w:pPr>
-      <w:r>
-        <w:rPr>
-          <w:rStyle w:val="CdigoHTML"/>
-          <w:rFonts w:ascii="Arial" w:hAnsi="Arial" w:cs="Arial"/>
-          <w:sz w:val="22"/>
-          <w:szCs w:val="22"/>
-        </w:rPr>
-        <w:t xml:space="preserve">├── </w:t>
+          <w:rFonts w:ascii="Consolas" w:eastAsia="Times New Roman" w:hAnsi="Consolas" w:cs="Courier New"/>
+          <w:color w:val="F0F6FC"/>
+          <w:sz w:val="20"/>
+          <w:szCs w:val="20"/>
+          <w:bdr w:val="none" w:sz="0" w:space="0" w:color="auto" w:frame="1"/>
+          <w:lang w:eastAsia="es-CO"/>
+        </w:rPr>
+        <w:t xml:space="preserve"> Pesaje.docx</w:t>
+      </w:r>
+    </w:p>
+    <w:p>
+      <w:pPr>
+        <w:shd w:val="clear" w:color="auto" w:fill="151B23"/>
+        <w:tabs>
+          <w:tab w:val="left" w:pos="916"/>
+          <w:tab w:val="left" w:pos="1832"/>
+          <w:tab w:val="left" w:pos="2748"/>
+          <w:tab w:val="left" w:pos="3664"/>
+          <w:tab w:val="left" w:pos="4580"/>
+          <w:tab w:val="left" w:pos="5496"/>
+          <w:tab w:val="left" w:pos="6412"/>
+          <w:tab w:val="left" w:pos="7328"/>
+          <w:tab w:val="left" w:pos="8244"/>
+          <w:tab w:val="left" w:pos="9160"/>
+          <w:tab w:val="left" w:pos="10076"/>
+          <w:tab w:val="left" w:pos="10992"/>
+          <w:tab w:val="left" w:pos="11908"/>
+          <w:tab w:val="left" w:pos="12824"/>
+          <w:tab w:val="left" w:pos="13740"/>
+          <w:tab w:val="left" w:pos="14656"/>
+        </w:tabs>
+        <w:spacing w:after="0" w:line="240" w:lineRule="auto"/>
+        <w:rPr>
+          <w:rFonts w:ascii="Consolas" w:eastAsia="Times New Roman" w:hAnsi="Consolas" w:cs="Courier New"/>
+          <w:color w:val="F0F6FC"/>
+          <w:sz w:val="20"/>
+          <w:szCs w:val="20"/>
+          <w:bdr w:val="none" w:sz="0" w:space="0" w:color="auto" w:frame="1"/>
+          <w:lang w:eastAsia="es-CO"/>
+        </w:rPr>
+      </w:pPr>
+      <w:r>
+        <w:rPr>
+          <w:rFonts w:ascii="Consolas" w:eastAsia="Times New Roman" w:hAnsi="Consolas" w:cs="Courier New"/>
+          <w:color w:val="F0F6FC"/>
+          <w:sz w:val="20"/>
+          <w:szCs w:val="20"/>
+          <w:bdr w:val="none" w:sz="0" w:space="0" w:color="auto" w:frame="1"/>
+          <w:lang w:eastAsia="es-CO"/>
+        </w:rPr>
+        <w:t>├─</w:t>
+      </w:r>
+      <w:proofErr w:type="gramStart"/>
+      <w:r>
+        <w:rPr>
+          <w:rFonts w:ascii="Consolas" w:eastAsia="Times New Roman" w:hAnsi="Consolas" w:cs="Courier New"/>
+          <w:color w:val="F0F6FC"/>
+          <w:sz w:val="20"/>
+          <w:szCs w:val="20"/>
+          <w:bdr w:val="none" w:sz="0" w:space="0" w:color="auto" w:frame="1"/>
+          <w:lang w:eastAsia="es-CO"/>
+        </w:rPr>
+        <w:t>─ .</w:t>
       </w:r>
       <w:proofErr w:type="spellStart"/>
       <w:r>
         <w:rPr>
-          <w:rStyle w:val="CdigoHTML"/>
-          <w:rFonts w:ascii="Arial" w:hAnsi="Arial" w:cs="Arial"/>
-          <w:sz w:val="22"/>
-          <w:szCs w:val="22"/>
-        </w:rPr>
-        <w:t>view</w:t>
+          <w:rFonts w:ascii="Consolas" w:eastAsia="Times New Roman" w:hAnsi="Consolas" w:cs="Courier New"/>
+          <w:color w:val="F0F6FC"/>
+          <w:sz w:val="20"/>
+          <w:szCs w:val="20"/>
+          <w:bdr w:val="none" w:sz="0" w:space="0" w:color="auto" w:frame="1"/>
+          <w:lang w:eastAsia="es-CO"/>
+        </w:rPr>
+        <w:t>gitignore</w:t>
       </w:r>
       <w:proofErr w:type="spellEnd"/>
-      <w:r>
-        <w:rPr>
-          <w:rStyle w:val="CdigoHTML"/>
-          <w:rFonts w:ascii="Arial" w:hAnsi="Arial" w:cs="Arial"/>
-          <w:sz w:val="22"/>
-          <w:szCs w:val="22"/>
-        </w:rPr>
-        <w:t>/</w:t>
-      </w:r>
-    </w:p>
-    <w:p>
-      <w:pPr>
-        <w:pStyle w:val="HTMLconformatoprevio"/>
-        <w:rPr>
-          <w:rStyle w:val="CdigoHTML"/>
-          <w:rFonts w:ascii="Arial" w:hAnsi="Arial" w:cs="Arial"/>
-          <w:sz w:val="22"/>
-          <w:szCs w:val="22"/>
-        </w:rPr>
-      </w:pPr>
-      <w:r>
-        <w:rPr>
-          <w:rStyle w:val="CdigoHTML"/>
-          <w:rFonts w:ascii="Arial" w:hAnsi="Arial" w:cs="Arial"/>
-          <w:sz w:val="22"/>
-          <w:szCs w:val="22"/>
-        </w:rPr>
-        <w:t>│   └── MainView.java</w:t>
-      </w:r>
-    </w:p>
-    <w:p>
-      <w:pPr>
-        <w:pStyle w:val="HTMLconformatoprevio"/>
-        <w:rPr>
-          <w:rStyle w:val="CdigoHTML"/>
-          <w:rFonts w:ascii="Arial" w:hAnsi="Arial" w:cs="Arial"/>
-          <w:sz w:val="22"/>
-          <w:szCs w:val="22"/>
-        </w:rPr>
-      </w:pPr>
-      <w:r>
-        <w:rPr>
-          <w:rStyle w:val="CdigoHTML"/>
-          <w:rFonts w:ascii="Arial" w:hAnsi="Arial" w:cs="Arial"/>
-          <w:sz w:val="22"/>
-          <w:szCs w:val="22"/>
-        </w:rPr>
-        <w:t>│</w:t>
-      </w:r>
-    </w:p>
-    <w:p>
-      <w:pPr>
-        <w:pStyle w:val="HTMLconformatoprevio"/>
-        <w:rPr>
-          <w:rStyle w:val="CdigoHTML"/>
-          <w:rFonts w:ascii="Arial" w:hAnsi="Arial" w:cs="Arial"/>
-          <w:sz w:val="22"/>
-          <w:szCs w:val="22"/>
-        </w:rPr>
-      </w:pPr>
-      <w:r>
-        <w:rPr>
-          <w:rStyle w:val="CdigoHTML"/>
-          <w:rFonts w:ascii="Arial" w:hAnsi="Arial" w:cs="Arial"/>
-          <w:sz w:val="22"/>
-          <w:szCs w:val="22"/>
-        </w:rPr>
-        <w:t>└── Main.java</w:t>
-      </w:r>
-    </w:p>
-    <w:p>
-      <w:pPr>
-        <w:rPr>
-          <w:rFonts w:ascii="Arial" w:hAnsi="Arial" w:cs="Arial"/>
-        </w:rPr>
-      </w:pPr>
-      <w:r>
-        <w:rPr>
-          <w:rFonts w:ascii="Arial" w:hAnsi="Arial" w:cs="Arial"/>
-        </w:rPr>
-        <w:lastRenderedPageBreak/>
+      <w:proofErr w:type="gramEnd"/>
+    </w:p>
+    <w:p>
+      <w:pPr>
+        <w:shd w:val="clear" w:color="auto" w:fill="151B23"/>
+        <w:tabs>
+          <w:tab w:val="left" w:pos="916"/>
+          <w:tab w:val="left" w:pos="1832"/>
+          <w:tab w:val="left" w:pos="2748"/>
+          <w:tab w:val="left" w:pos="3664"/>
+          <w:tab w:val="left" w:pos="4580"/>
+          <w:tab w:val="left" w:pos="5496"/>
+          <w:tab w:val="left" w:pos="6412"/>
+          <w:tab w:val="left" w:pos="7328"/>
+          <w:tab w:val="left" w:pos="8244"/>
+          <w:tab w:val="left" w:pos="9160"/>
+          <w:tab w:val="left" w:pos="10076"/>
+          <w:tab w:val="left" w:pos="10992"/>
+          <w:tab w:val="left" w:pos="11908"/>
+          <w:tab w:val="left" w:pos="12824"/>
+          <w:tab w:val="left" w:pos="13740"/>
+          <w:tab w:val="left" w:pos="14656"/>
+        </w:tabs>
+        <w:spacing w:after="0" w:line="240" w:lineRule="auto"/>
+        <w:rPr>
+          <w:rFonts w:ascii="Consolas" w:eastAsia="Times New Roman" w:hAnsi="Consolas" w:cs="Courier New"/>
+          <w:color w:val="F0F6FC"/>
+          <w:sz w:val="20"/>
+          <w:szCs w:val="20"/>
+          <w:lang w:eastAsia="es-CO"/>
+        </w:rPr>
+      </w:pPr>
+      <w:r>
+        <w:rPr>
+          <w:rFonts w:ascii="Consolas" w:eastAsia="Times New Roman" w:hAnsi="Consolas" w:cs="Courier New"/>
+          <w:color w:val="F0F6FC"/>
+          <w:sz w:val="20"/>
+          <w:szCs w:val="20"/>
+          <w:bdr w:val="none" w:sz="0" w:space="0" w:color="auto" w:frame="1"/>
+          <w:lang w:eastAsia="es-CO"/>
+        </w:rPr>
+        <w:t>└── README.md</w:t>
+      </w:r>
+    </w:p>
+    <w:p>
+      <w:pPr>
+        <w:rPr>
+          <w:rFonts w:ascii="Arial" w:hAnsi="Arial" w:cs="Arial"/>
+        </w:rPr>
+      </w:pPr>
+      <w:r>
+        <w:rPr>
+          <w:rFonts w:ascii="Arial" w:hAnsi="Arial" w:cs="Arial"/>
+        </w:rPr>
         <w:pict w14:anchorId="5B433BB0">
           <v:rect id="_x0000_i1031" style="width:0;height:1.5pt" o:hralign="center" o:hrstd="t" o:hr="t" fillcolor="#a0a0a0" stroked="f"/>
         </w:pict>
@@ -3463,6 +3954,7 @@
           <w:sz w:val="22"/>
           <w:szCs w:val="22"/>
         </w:rPr>
+        <w:lastRenderedPageBreak/>
         <w:t>📸</w:t>
       </w:r>
       <w:r>
@@ -3718,6 +4210,7 @@
       <w:r>
         <w:rPr>
           <w:rFonts w:ascii="Arial" w:hAnsi="Arial" w:cs="Arial"/>
+          <w:noProof/>
           <w:sz w:val="22"/>
           <w:szCs w:val="22"/>
         </w:rPr>
@@ -3757,12 +4250,237 @@
           </wp:inline>
         </w:drawing>
       </w:r>
-      <w:r>
-        <w:rPr>
-          <w:rFonts w:ascii="Arial" w:hAnsi="Arial" w:cs="Arial"/>
-          <w:sz w:val="22"/>
-          <w:szCs w:val="22"/>
-        </w:rPr>
+    </w:p>
+    <w:p>
+      <w:pPr>
+        <w:pStyle w:val="NormalWeb"/>
+        <w:rPr>
+          <w:rFonts w:ascii="Segoe UI Emoji" w:hAnsi="Segoe UI Emoji" w:cs="Segoe UI Emoji"/>
+          <w:sz w:val="22"/>
+          <w:szCs w:val="22"/>
+        </w:rPr>
+      </w:pPr>
+    </w:p>
+    <w:p>
+      <w:pPr>
+        <w:pStyle w:val="NormalWeb"/>
+        <w:rPr>
+          <w:rFonts w:ascii="Segoe UI Emoji" w:hAnsi="Segoe UI Emoji" w:cs="Segoe UI Emoji"/>
+          <w:sz w:val="22"/>
+          <w:szCs w:val="22"/>
+        </w:rPr>
+      </w:pPr>
+    </w:p>
+    <w:p>
+      <w:pPr>
+        <w:pStyle w:val="NormalWeb"/>
+        <w:rPr>
+          <w:rFonts w:ascii="Arial" w:hAnsi="Arial" w:cs="Arial"/>
+          <w:sz w:val="22"/>
+          <w:szCs w:val="22"/>
+          <w:u w:val="single"/>
+        </w:rPr>
+      </w:pPr>
+      <w:r>
+        <w:rPr>
+          <w:rFonts w:ascii="Segoe UI Emoji" w:hAnsi="Segoe UI Emoji" w:cs="Segoe UI Emoji"/>
+          <w:sz w:val="22"/>
+          <w:szCs w:val="22"/>
+        </w:rPr>
+        <w:lastRenderedPageBreak/>
+        <w:t>📌</w:t>
+      </w:r>
+      <w:r>
+        <w:rPr>
+          <w:rFonts w:ascii="Arial" w:hAnsi="Arial" w:cs="Arial"/>
+          <w:sz w:val="22"/>
+          <w:szCs w:val="22"/>
+        </w:rPr>
+        <w:t xml:space="preserve"> </w:t>
+      </w:r>
+      <w:r>
+        <w:rPr>
+          <w:rFonts w:ascii="Arial" w:hAnsi="Arial" w:cs="Arial"/>
+          <w:sz w:val="22"/>
+          <w:szCs w:val="22"/>
+        </w:rPr>
+        <w:t>Captura Del Terminal Ejecutando Git:</w:t>
+      </w:r>
+    </w:p>
+    <w:p>
+      <w:pPr>
+        <w:pStyle w:val="NormalWeb"/>
+        <w:rPr>
+          <w:rFonts w:ascii="Arial" w:hAnsi="Arial" w:cs="Arial"/>
+          <w:sz w:val="22"/>
+          <w:szCs w:val="22"/>
+        </w:rPr>
+      </w:pPr>
+      <w:r>
+        <w:rPr>
+          <w:rFonts w:ascii="Arial" w:hAnsi="Arial" w:cs="Arial"/>
+          <w:sz w:val="22"/>
+          <w:szCs w:val="22"/>
+        </w:rPr>
+        <w:drawing>
+          <wp:inline distT="0" distB="0" distL="0" distR="0" wp14:anchorId="7A04A6A3" wp14:editId="1B6F693D">
+            <wp:extent cx="6118860" cy="4107180"/>
+            <wp:effectExtent l="0" t="0" r="0" b="7620"/>
+            <wp:docPr id="2" name="Imagen 2"/>
+            <wp:cNvGraphicFramePr>
+              <a:graphicFrameLocks xmlns:a="http://schemas.openxmlformats.org/drawingml/2006/main" noChangeAspect="1"/>
+            </wp:cNvGraphicFramePr>
+            <a:graphic xmlns:a="http://schemas.openxmlformats.org/drawingml/2006/main">
+              <a:graphicData uri="http://schemas.openxmlformats.org/drawingml/2006/picture">
+                <pic:pic xmlns:pic="http://schemas.openxmlformats.org/drawingml/2006/picture">
+                  <pic:nvPicPr>
+                    <pic:cNvPr id="1" name=""/>
+                    <pic:cNvPicPr/>
+                  </pic:nvPicPr>
+                  <pic:blipFill>
+                    <a:blip r:embed="rId9"/>
+                    <a:stretch>
+                      <a:fillRect/>
+                    </a:stretch>
+                  </pic:blipFill>
+                  <pic:spPr>
+                    <a:xfrm>
+                      <a:off x="0" y="0"/>
+                      <a:ext cx="6118860" cy="4107180"/>
+                    </a:xfrm>
+                    <a:prstGeom prst="rect">
+                      <a:avLst/>
+                    </a:prstGeom>
+                  </pic:spPr>
+                </pic:pic>
+              </a:graphicData>
+            </a:graphic>
+          </wp:inline>
+        </w:drawing>
+      </w:r>
+    </w:p>
+    <w:p>
+      <w:pPr>
+        <w:pStyle w:val="NormalWeb"/>
+        <w:rPr>
+          <w:rFonts w:ascii="Arial" w:hAnsi="Arial" w:cs="Arial"/>
+          <w:sz w:val="22"/>
+          <w:szCs w:val="22"/>
+          <w:u w:val="single"/>
+        </w:rPr>
+      </w:pPr>
+      <w:r>
+        <w:rPr>
+          <w:rFonts w:ascii="Segoe UI Emoji" w:hAnsi="Segoe UI Emoji" w:cs="Segoe UI Emoji"/>
+          <w:sz w:val="22"/>
+          <w:szCs w:val="22"/>
+        </w:rPr>
+        <w:t>📌</w:t>
+      </w:r>
+      <w:r>
+        <w:rPr>
+          <w:rFonts w:ascii="Arial" w:hAnsi="Arial" w:cs="Arial"/>
+          <w:sz w:val="22"/>
+          <w:szCs w:val="22"/>
+        </w:rPr>
+        <w:t xml:space="preserve"> </w:t>
+      </w:r>
+      <w:r>
+        <w:rPr>
+          <w:rFonts w:ascii="Arial" w:hAnsi="Arial" w:cs="Arial"/>
+          <w:sz w:val="22"/>
+          <w:szCs w:val="22"/>
+        </w:rPr>
+        <w:t xml:space="preserve">Prototipo de la app pesaje funcionando: </w:t>
+      </w:r>
+    </w:p>
+    <w:p>
+      <w:pPr>
+        <w:pStyle w:val="NormalWeb"/>
+        <w:rPr>
+          <w:rFonts w:ascii="Arial" w:hAnsi="Arial" w:cs="Arial"/>
+          <w:sz w:val="22"/>
+          <w:szCs w:val="22"/>
+          <w:u w:val="single"/>
+        </w:rPr>
+      </w:pPr>
+      <w:r>
+        <w:rPr>
+          <w:rFonts w:ascii="Arial" w:hAnsi="Arial" w:cs="Arial"/>
+          <w:sz w:val="22"/>
+          <w:szCs w:val="22"/>
+        </w:rPr>
+        <w:drawing>
+          <wp:inline distT="0" distB="0" distL="0" distR="0" wp14:anchorId="5CB15859" wp14:editId="3CD9E054">
+            <wp:extent cx="5343525" cy="2834640"/>
+            <wp:effectExtent l="0" t="0" r="9525" b="3810"/>
+            <wp:docPr id="9" name="Imagen 9"/>
+            <wp:cNvGraphicFramePr>
+              <a:graphicFrameLocks xmlns:a="http://schemas.openxmlformats.org/drawingml/2006/main" noChangeAspect="1"/>
+            </wp:cNvGraphicFramePr>
+            <a:graphic xmlns:a="http://schemas.openxmlformats.org/drawingml/2006/main">
+              <a:graphicData uri="http://schemas.openxmlformats.org/drawingml/2006/picture">
+                <pic:pic xmlns:pic="http://schemas.openxmlformats.org/drawingml/2006/picture">
+                  <pic:nvPicPr>
+                    <pic:cNvPr id="1" name=""/>
+                    <pic:cNvPicPr/>
+                  </pic:nvPicPr>
+                  <pic:blipFill>
+                    <a:blip r:embed="rId10"/>
+                    <a:stretch>
+                      <a:fillRect/>
+                    </a:stretch>
+                  </pic:blipFill>
+                  <pic:spPr>
+                    <a:xfrm>
+                      <a:off x="0" y="0"/>
+                      <a:ext cx="5344276" cy="2835038"/>
+                    </a:xfrm>
+                    <a:prstGeom prst="rect">
+                      <a:avLst/>
+                    </a:prstGeom>
+                  </pic:spPr>
+                </pic:pic>
+              </a:graphicData>
+            </a:graphic>
+          </wp:inline>
+        </w:drawing>
+      </w:r>
+      <w:r>
+        <w:rPr>
+          <w:rFonts w:ascii="Arial" w:hAnsi="Arial" w:cs="Arial"/>
+          <w:sz w:val="22"/>
+          <w:szCs w:val="22"/>
+        </w:rPr>
+        <w:t xml:space="preserve"> </w:t>
+      </w:r>
+    </w:p>
+    <w:p>
+      <w:pPr>
+        <w:pStyle w:val="NormalWeb"/>
+        <w:rPr>
+          <w:rFonts w:ascii="Arial" w:hAnsi="Arial" w:cs="Arial"/>
+          <w:sz w:val="22"/>
+          <w:szCs w:val="22"/>
+        </w:rPr>
+      </w:pPr>
+    </w:p>
+    <w:p>
+      <w:pPr>
+        <w:pStyle w:val="NormalWeb"/>
+        <w:rPr>
+          <w:rFonts w:ascii="Arial" w:hAnsi="Arial" w:cs="Arial"/>
+          <w:sz w:val="22"/>
+          <w:szCs w:val="22"/>
+        </w:rPr>
+      </w:pPr>
+      <w:r>
+        <w:rPr>
+          <w:rFonts w:ascii="Arial" w:hAnsi="Arial" w:cs="Arial"/>
+          <w:sz w:val="22"/>
+          <w:szCs w:val="22"/>
+        </w:rPr>
+        <w:lastRenderedPageBreak/>
         <w:br/>
       </w:r>
     </w:p>
@@ -3784,6 +4502,7 @@
     <w:p>
       <w:pPr>
         <w:pStyle w:val="Ttulo2"/>
+        <w:jc w:val="center"/>
         <w:rPr>
           <w:rFonts w:ascii="Arial" w:hAnsi="Arial" w:cs="Arial"/>
           <w:b/>
@@ -3800,7 +4519,6 @@
           <w:sz w:val="22"/>
           <w:szCs w:val="22"/>
         </w:rPr>
-        <w:lastRenderedPageBreak/>
         <w:t xml:space="preserve">5. </w:t>
       </w:r>
       <w:r>
@@ -4122,6 +4840,7 @@
     <w:p>
       <w:pPr>
         <w:pStyle w:val="Ttulo2"/>
+        <w:jc w:val="center"/>
         <w:rPr>
           <w:rFonts w:ascii="Arial" w:hAnsi="Arial" w:cs="Arial"/>
           <w:b/>
@@ -4210,7 +4929,7 @@
         </w:rPr>
         <w:t xml:space="preserve">. Recuperado de </w:t>
       </w:r>
-      <w:hyperlink r:id="rId9" w:history="1">
+      <w:hyperlink r:id="rId11" w:history="1">
         <w:r>
           <w:rPr>
             <w:rStyle w:val="Hipervnculo"/>
@@ -4271,7 +4990,7 @@
         </w:rPr>
         <w:t xml:space="preserve">. Recuperado de </w:t>
       </w:r>
-      <w:hyperlink r:id="rId10" w:history="1">
+      <w:hyperlink r:id="rId12" w:history="1">
         <w:r>
           <w:rPr>
             <w:rStyle w:val="Hipervnculo"/>

</xml_diff>